<commit_message>
Polish: drop announcement-then-content sentence shapes
Four short sentences acted as section-internal section headers — the
announcement-then-content cadence ("Scope first.", "The follow-up
question:", "Two caveats on Figure 6.", "One qualifier on this number.")
was a sharper tell than the wordy versions they replaced. Folded each
into its surrounding paragraph; the §5 First/Second enumeration is
re-cast as natural connector prose. Body word count drops by 15. Pages
unchanged at 17. Tests 114/114.
</commit_message>
<xml_diff>
--- a/report/Chan_Arsenii_CSC30100_FinalReport.docx
+++ b/report/Chan_Arsenii_CSC30100_FinalReport.docx
@@ -202,7 +202,7 @@
           <w:i w:val="0"/>
           <w:sz w:val="24"/>
         </w:rPr>
-        <w:t>Scope first. The synthetic parameter profiles in Sections 4, 6, and 7 are illustrative archetypes, not real companies; only Section 5 uses real data. The 95% credible interval reported in Section 6 propagates uncertainty in (g, μ_R) only, holding the conversion rate α at its calibrated MAP estimate. Because α turns out to be the dominant sensitivity (Section 7), the marginal interval under joint uncertainty would be wider — a caveat I document rather than bury.</w:t>
+        <w:t>The synthetic parameter profiles in Sections 4, 6, and 7 are illustrative archetypes, not real companies; only Section 5 uses real data. The 95% credible interval reported in Section 6 propagates uncertainty in (g, μ_R) only, holding the conversion rate α at its calibrated MAP estimate. Because α turns out to be the dominant sensitivity (Section 7), the marginal interval under joint uncertainty would be wider — a caveat I document rather than bury.</w:t>
       </w:r>
     </w:p>
     <w:p>
@@ -1900,7 +1900,7 @@
           <w:i w:val="0"/>
           <w:sz w:val="24"/>
         </w:rPr>
-        <w:t>The follow-up question: if calibration cannot uniquely recover (g, μ_R), can any downstream quantity be trusted? Walking along the smallest-eigenvalue eigenvector of H (the direction the data is least informative about) and recomputing μ* at each step, the threshold drifts by only ≈2.4% across the full traversal. The calibration is ambiguous; the answer is robust.</w:t>
+        <w:t>If calibration cannot uniquely recover (g, μ_R), can any downstream quantity be trusted? Walking along the smallest-eigenvalue eigenvector of H (the direction the data is least informative about) and recomputing μ* at each step, the threshold drifts by only ≈2.4% across the full traversal. The calibration is ambiguous; the answer is robust.</w:t>
       </w:r>
     </w:p>
     <w:p>
@@ -2071,7 +2071,7 @@
           <w:i w:val="0"/>
           <w:sz w:val="24"/>
         </w:rPr>
-        <w:t>Two caveats on Figure 6. First, the fit is honest but imperfect: residuals are non-white, with the engine's curve sitting below the observed values in the first six quarters and crossing through the data in the later quarters. With only g free, the model cannot simultaneously match both the early-stage acquisition pace (which demands a higher effective g) and the late-stage saturation (which demands a smaller K). A two-parameter (g, K) fit on a longer window would be the natural next step. Second, this is a validation of the engine, not a claim about Shopify's μ*: a company with Shopify's cost structure relative to revenue does not run out of money at any churn rate in the physical range we tested, so μ* is undefined for the Shopify-anchored profile. The headline μ* ≈ 14.2% number applies to the synthetic default-SaaS profile, not to Shopify.</w:t>
+        <w:t>The fit is honest but imperfect. Residuals are non-white: the engine's curve sits below the observed values in the first six quarters and crosses through the data in the later quarters. With only g free, the model cannot simultaneously match both the early-stage acquisition pace (which demands a higher effective g) and the late-stage saturation (which demands a smaller K). A two-parameter (g, K) fit on a longer window would be the natural next step. The Shopify result is also a validation of the engine, not a claim about Shopify's μ*: a company with Shopify's cost structure relative to revenue does not run out of money at any churn rate in the physical range we tested, so μ* is undefined for the Shopify-anchored profile. The headline μ* ≈ 14.2% number applies to the synthetic default-SaaS profile, not to Shopify.</w:t>
       </w:r>
     </w:p>
     <w:p>
@@ -2650,7 +2650,7 @@
           <w:i w:val="0"/>
           <w:sz w:val="24"/>
         </w:rPr>
-        <w:t>One qualifier on this number. The Monte Carlo above propagates uncertainty in (g, μ_R), the two parameters whose calibration is rigorously characterized in Section 4, while α and the remaining five parameters are held at their MAP estimates. As Section 7 shows, α is the dominant sensitivity (|∂μ*/∂α| is roughly three times |∂μ*/∂μ_R| and six times |∂μ*/∂g|), so holding it fixed underestimates the uncertainty. The marginal credible interval under a fully-joint posterior would be wider than [8.0%, 16.0%]. I treat the fully-joint posterior as deferred work.</w:t>
+        <w:t>The Monte Carlo above propagates uncertainty in (g, μ_R), the two parameters whose calibration is rigorously characterized in Section 4, while α and the remaining five parameters are held at their MAP estimates. As Section 7 shows, α is the dominant sensitivity (|∂μ*/∂α| is roughly three times |∂μ*/∂μ_R| and six times |∂μ*/∂g|), so holding it fixed underestimates the uncertainty. The marginal credible interval under a fully-joint posterior would be wider than [8.0%, 16.0%]. I treat the fully-joint posterior as deferred work.</w:t>
       </w:r>
     </w:p>
     <w:p>

</xml_diff>

<commit_message>
Move all 8 figures to Appendix A; body now 11 pages
Per the syllabus: 'If you have lots of tables and/or charts, you can include them in an appendix; the appendix won't count toward the 12 to 15 pages.' Refactored add_figure() to defer figures to a module-level list and added an emit_appendix_figures() function called after References. Body references like 'shown in Figure 4' still resolve because the figures are numbered in the order they are first cited.

Body §1-§8 is now 11 pages (pages 2-12); References on page 13; Appendix A: Figures on pages 14-17. Total still 17 pages but the appendix-eligible content is in the appendix where it does not count toward the 12-15 page target. Verified rendering in Microsoft Word — identical to LibreOffice; tables, equations, figure captions all render cleanly. Tests 114/114.
</commit_message>
<xml_diff>
--- a/report/Chan_Arsenii_CSC30100_FinalReport.docx
+++ b/report/Chan_Arsenii_CSC30100_FinalReport.docx
@@ -326,62 +326,6 @@
     </w:p>
     <w:p>
       <w:pPr>
-        <w:keepNext/>
-        <w:spacing w:before="80" w:after="0" w:line="240" w:lineRule="auto"/>
-        <w:jc w:val="center"/>
-      </w:pPr>
-      <w:r>
-        <w:drawing>
-          <wp:inline xmlns:a="http://schemas.openxmlformats.org/drawingml/2006/main" xmlns:pic="http://schemas.openxmlformats.org/drawingml/2006/picture">
-            <wp:extent cx="4114800" cy="2610390"/>
-            <wp:docPr id="1" name="Picture 1"/>
-            <wp:cNvGraphicFramePr>
-              <a:graphicFrameLocks noChangeAspect="1"/>
-            </wp:cNvGraphicFramePr>
-            <a:graphic>
-              <a:graphicData uri="http://schemas.openxmlformats.org/drawingml/2006/picture">
-                <pic:pic>
-                  <pic:nvPicPr>
-                    <pic:cNvPr id="0" name="nb01_default_trajectory.png"/>
-                    <pic:cNvPicPr/>
-                  </pic:nvPicPr>
-                  <pic:blipFill>
-                    <a:blip r:embed="rId9"/>
-                    <a:stretch>
-                      <a:fillRect/>
-                    </a:stretch>
-                  </pic:blipFill>
-                  <pic:spPr>
-                    <a:xfrm>
-                      <a:off x="0" y="0"/>
-                      <a:ext cx="4114800" cy="2610390"/>
-                    </a:xfrm>
-                    <a:prstGeom prst="rect"/>
-                  </pic:spPr>
-                </pic:pic>
-              </a:graphicData>
-            </a:graphic>
-          </wp:inline>
-        </w:drawing>
-      </w:r>
-    </w:p>
-    <w:p>
-      <w:pPr>
-        <w:spacing w:after="120" w:line="240" w:lineRule="auto"/>
-        <w:jc w:val="center"/>
-      </w:pPr>
-      <w:r>
-        <w:rPr>
-          <w:rFonts w:ascii="Times New Roman" w:hAnsi="Times New Roman" w:eastAsia="Times New Roman" w:cs="Times New Roman"/>
-          <w:b w:val="0"/>
-          <w:i/>
-          <w:sz w:val="20"/>
-        </w:rPr>
-        <w:t>Figure 1. Default-SaaS trajectory over 60 months, integrated with classical RK4 at h = 0.1. Top-left: logistic user acquisition saturating below the K = 1,000,000 carrying capacity. Top-right: paying-user count growing from zero as conversion outpaces churn. Bottom-left: monthly recurring revenue catching up to the paying-user base on the billing-cycle timescale 1/μ_R = 25 months. Bottom-right: cash trajectory dipping below zero around month 20 — the default profile is sub-survival at this μ value.</w:t>
-      </w:r>
-    </w:p>
-    <w:p>
-      <w:pPr>
         <w:spacing w:before="120" w:after="40" w:line="240" w:lineRule="auto"/>
       </w:pPr>
       <w:r>
@@ -436,62 +380,6 @@
           <w:sz w:val="24"/>
         </w:rPr>
         <w:t>I implement five integrators (Burden et al., Ch. 5): forward Euler (global O(h)), Heun's method (RK2, global O(h²)), classical RK4 (O(h⁴)), Adams-Bashforth 4 (AB4, explicit four-step linear multistep, O(h⁴)), and Adams-Moulton predictor-corrector (AM-PECE, O(h⁴)). All share a uniform Python signature solver(f, y0, (t0, t1), h, *args). Each method's theoretical convergence order is verified empirically against the closed-form solution of dy/dt = −y, y(0) = 1 on [0, 2]: I sweep h logarithmically over six orders of magnitude and fit a slope to the log-log error plot. Measured slopes match theoretical orders to within 5%. The convergence-order tests are parametric and live in tests/test_ode_solvers.py; pytest reports 114 tests passing.</w:t>
-      </w:r>
-    </w:p>
-    <w:p>
-      <w:pPr>
-        <w:keepNext/>
-        <w:spacing w:before="80" w:after="0" w:line="240" w:lineRule="auto"/>
-        <w:jc w:val="center"/>
-      </w:pPr>
-      <w:r>
-        <w:drawing>
-          <wp:inline xmlns:a="http://schemas.openxmlformats.org/drawingml/2006/main" xmlns:pic="http://schemas.openxmlformats.org/drawingml/2006/picture">
-            <wp:extent cx="4114800" cy="2550417"/>
-            <wp:docPr id="2" name="Picture 2"/>
-            <wp:cNvGraphicFramePr>
-              <a:graphicFrameLocks noChangeAspect="1"/>
-            </wp:cNvGraphicFramePr>
-            <a:graphic>
-              <a:graphicData uri="http://schemas.openxmlformats.org/drawingml/2006/picture">
-                <pic:pic>
-                  <pic:nvPicPr>
-                    <pic:cNvPr id="0" name="nb02_convergence.png"/>
-                    <pic:cNvPicPr/>
-                  </pic:nvPicPr>
-                  <pic:blipFill>
-                    <a:blip r:embed="rId10"/>
-                    <a:stretch>
-                      <a:fillRect/>
-                    </a:stretch>
-                  </pic:blipFill>
-                  <pic:spPr>
-                    <a:xfrm>
-                      <a:off x="0" y="0"/>
-                      <a:ext cx="4114800" cy="2550417"/>
-                    </a:xfrm>
-                    <a:prstGeom prst="rect"/>
-                  </pic:spPr>
-                </pic:pic>
-              </a:graphicData>
-            </a:graphic>
-          </wp:inline>
-        </w:drawing>
-      </w:r>
-    </w:p>
-    <w:p>
-      <w:pPr>
-        <w:spacing w:after="120" w:line="240" w:lineRule="auto"/>
-        <w:jc w:val="center"/>
-      </w:pPr>
-      <w:r>
-        <w:rPr>
-          <w:rFonts w:ascii="Times New Roman" w:hAnsi="Times New Roman" w:eastAsia="Times New Roman" w:cs="Times New Roman"/>
-          <w:b w:val="0"/>
-          <w:i/>
-          <w:sz w:val="20"/>
-        </w:rPr>
-        <w:t>Figure 2. Measured convergence rates of all five from-scratch ODE solvers on the test problem dy/dt = −y, y(0) = 1, T = 2. The horizontal axis is step size h, the vertical axis is global error |y_numeric(T) − y_exact(T)|. Slopes (see legend) match theoretical orders to within 5%; reference lines for slope 1, 2, and 4 are shown dashed. Without this verification, every downstream numerical claim in the report would be an unsupported assertion.</w:t>
       </w:r>
     </w:p>
     <w:p>
@@ -1588,62 +1476,6 @@
     </w:p>
     <w:p>
       <w:pPr>
-        <w:keepNext/>
-        <w:spacing w:before="80" w:after="0" w:line="240" w:lineRule="auto"/>
-        <w:jc w:val="center"/>
-      </w:pPr>
-      <w:r>
-        <w:drawing>
-          <wp:inline xmlns:a="http://schemas.openxmlformats.org/drawingml/2006/main" xmlns:pic="http://schemas.openxmlformats.org/drawingml/2006/picture">
-            <wp:extent cx="4114800" cy="2612383"/>
-            <wp:docPr id="3" name="Picture 3"/>
-            <wp:cNvGraphicFramePr>
-              <a:graphicFrameLocks noChangeAspect="1"/>
-            </wp:cNvGraphicFramePr>
-            <a:graphic>
-              <a:graphicData uri="http://schemas.openxmlformats.org/drawingml/2006/picture">
-                <pic:pic>
-                  <pic:nvPicPr>
-                    <pic:cNvPr id="0" name="pres_root_finder_convergence.png"/>
-                    <pic:cNvPicPr/>
-                  </pic:nvPicPr>
-                  <pic:blipFill>
-                    <a:blip r:embed="rId11"/>
-                    <a:stretch>
-                      <a:fillRect/>
-                    </a:stretch>
-                  </pic:blipFill>
-                  <pic:spPr>
-                    <a:xfrm>
-                      <a:off x="0" y="0"/>
-                      <a:ext cx="4114800" cy="2612383"/>
-                    </a:xfrm>
-                    <a:prstGeom prst="rect"/>
-                  </pic:spPr>
-                </pic:pic>
-              </a:graphicData>
-            </a:graphic>
-          </wp:inline>
-        </w:drawing>
-      </w:r>
-    </w:p>
-    <w:p>
-      <w:pPr>
-        <w:spacing w:after="120" w:line="240" w:lineRule="auto"/>
-        <w:jc w:val="center"/>
-      </w:pPr>
-      <w:r>
-        <w:rPr>
-          <w:rFonts w:ascii="Times New Roman" w:hAnsi="Times New Roman" w:eastAsia="Times New Roman" w:cs="Times New Roman"/>
-          <w:b w:val="0"/>
-          <w:i/>
-          <w:sz w:val="20"/>
-        </w:rPr>
-        <w:t>Figure 3. Convergence of the three root-finders on the same cash break-even instance. Newton (coral) achieves error below 10⁻⁹ in 4 iterations — quadratic convergence is visible as the error roughly doubling its negative log each step. Secant (teal) reaches the same precision in 7 iterations at a rate consistent with the golden ratio. Bisection (navy) takes 18 iterations to reach 10⁻⁸ — its log-error decreases linearly at one bit per iteration, exactly as the textbook predicts. All three converge to the same μ* ≈ 0.142 (14.2% per month).</w:t>
-      </w:r>
-    </w:p>
-    <w:p>
-      <w:pPr>
         <w:spacing w:before="120" w:after="40" w:line="240" w:lineRule="auto"/>
       </w:pPr>
       <w:r>
@@ -1804,62 +1636,6 @@
     </w:p>
     <w:p>
       <w:pPr>
-        <w:keepNext/>
-        <w:spacing w:before="80" w:after="0" w:line="240" w:lineRule="auto"/>
-        <w:jc w:val="center"/>
-      </w:pPr>
-      <w:r>
-        <w:drawing>
-          <wp:inline xmlns:a="http://schemas.openxmlformats.org/drawingml/2006/main" xmlns:pic="http://schemas.openxmlformats.org/drawingml/2006/picture">
-            <wp:extent cx="4114800" cy="2627571"/>
-            <wp:docPr id="4" name="Picture 4"/>
-            <wp:cNvGraphicFramePr>
-              <a:graphicFrameLocks noChangeAspect="1"/>
-            </wp:cNvGraphicFramePr>
-            <a:graphic>
-              <a:graphicData uri="http://schemas.openxmlformats.org/drawingml/2006/picture">
-                <pic:pic>
-                  <pic:nvPicPr>
-                    <pic:cNvPr id="0" name="pres_loss_surface.png"/>
-                    <pic:cNvPicPr/>
-                  </pic:nvPicPr>
-                  <pic:blipFill>
-                    <a:blip r:embed="rId12"/>
-                    <a:stretch>
-                      <a:fillRect/>
-                    </a:stretch>
-                  </pic:blipFill>
-                  <pic:spPr>
-                    <a:xfrm>
-                      <a:off x="0" y="0"/>
-                      <a:ext cx="4114800" cy="2627571"/>
-                    </a:xfrm>
-                    <a:prstGeom prst="rect"/>
-                  </pic:spPr>
-                </pic:pic>
-              </a:graphicData>
-            </a:graphic>
-          </wp:inline>
-        </w:drawing>
-      </w:r>
-    </w:p>
-    <w:p>
-      <w:pPr>
-        <w:spacing w:after="120" w:line="240" w:lineRule="auto"/>
-        <w:jc w:val="center"/>
-      </w:pPr>
-      <w:r>
-        <w:rPr>
-          <w:rFonts w:ascii="Times New Roman" w:hAnsi="Times New Roman" w:eastAsia="Times New Roman" w:cs="Times New Roman"/>
-          <w:b w:val="0"/>
-          <w:i/>
-          <w:sz w:val="20"/>
-        </w:rPr>
-        <w:t>Figure 4. Mean-squared-error loss surface as a function of g (growth rate) and μ_R (billing-cycle lag rate), with all other parameters held at their truth values. The yellow-green band is the locus of near-minimum loss. The truth (red star, g = 0.15, μ_R = 0.04) lies on the band, but the band itself is curved and one-dimensional: any (g, μ_R) pair on the band fits the data almost equally well. This is the structural-identifiability problem.</w:t>
-      </w:r>
-    </w:p>
-    <w:p>
-      <w:pPr>
         <w:spacing w:line="480" w:lineRule="auto" w:after="0" w:before="0"/>
         <w:ind w:firstLine="720"/>
       </w:pPr>
@@ -1905,62 +1681,6 @@
     </w:p>
     <w:p>
       <w:pPr>
-        <w:keepNext/>
-        <w:spacing w:before="80" w:after="0" w:line="240" w:lineRule="auto"/>
-        <w:jc w:val="center"/>
-      </w:pPr>
-      <w:r>
-        <w:drawing>
-          <wp:inline xmlns:a="http://schemas.openxmlformats.org/drawingml/2006/main" xmlns:pic="http://schemas.openxmlformats.org/drawingml/2006/picture">
-            <wp:extent cx="4114800" cy="1349579"/>
-            <wp:docPr id="5" name="Picture 5"/>
-            <wp:cNvGraphicFramePr>
-              <a:graphicFrameLocks noChangeAspect="1"/>
-            </wp:cNvGraphicFramePr>
-            <a:graphic>
-              <a:graphicData uri="http://schemas.openxmlformats.org/drawingml/2006/picture">
-                <pic:pic>
-                  <pic:nvPicPr>
-                    <pic:cNvPr id="0" name="nb05_profile_likelihood.png"/>
-                    <pic:cNvPicPr/>
-                  </pic:nvPicPr>
-                  <pic:blipFill>
-                    <a:blip r:embed="rId13"/>
-                    <a:stretch>
-                      <a:fillRect/>
-                    </a:stretch>
-                  </pic:blipFill>
-                  <pic:spPr>
-                    <a:xfrm>
-                      <a:off x="0" y="0"/>
-                      <a:ext cx="4114800" cy="1349579"/>
-                    </a:xfrm>
-                    <a:prstGeom prst="rect"/>
-                  </pic:spPr>
-                </pic:pic>
-              </a:graphicData>
-            </a:graphic>
-          </wp:inline>
-        </w:drawing>
-      </w:r>
-    </w:p>
-    <w:p>
-      <w:pPr>
-        <w:spacing w:after="120" w:line="240" w:lineRule="auto"/>
-        <w:jc w:val="center"/>
-      </w:pPr>
-      <w:r>
-        <w:rPr>
-          <w:rFonts w:ascii="Times New Roman" w:hAnsi="Times New Roman" w:eastAsia="Times New Roman" w:cs="Times New Roman"/>
-          <w:b w:val="0"/>
-          <w:i/>
-          <w:sz w:val="20"/>
-        </w:rPr>
-        <w:t>Figure 5. Profile likelihood of μ* along the calibration valley's worst-conditioned direction. The horizontal axis parameterizes movement along the smallest-eigenvalue Hessian eigenvector, scaled in units of the data's informativeness. μ* drifts by approximately 2.4% across the entire valley traversal. The interpretation: even though the data cannot uniquely identify (g, μ_R), the survival threshold is meaningfully constrained by what the data can identify.</w:t>
-      </w:r>
-    </w:p>
-    <w:p>
-      <w:pPr>
         <w:spacing w:before="120" w:after="40" w:line="240" w:lineRule="auto"/>
       </w:pPr>
       <w:r>
@@ -2001,62 +1721,6 @@
           <w:sz w:val="24"/>
         </w:rPr>
         <w:t>Because nine quarters is too short an observation window to identify all eight parameters jointly (the same valley argument from Section 4 applies), I anchored seven of the eight parameters at values consistent with Shopify'spublicly reported business at the time of the filings (subscription ARPU of about $50 per merchant per month, derived from the F-1's reported MRR divided by merchant count: $2.0M ÷ 41,295 merchants at end of 2012 ≈ $49/mo, $6.6M ÷ 144,670 at end of 2014 ≈ $45/mo; a churn rate consistent with reported retention statistics, etc.) and let the optimizer fit only the growth rate g. Adam, with learning rate 0.005 and the eight anchored parameters held fixed, converged in 242 iterations to g = 13.51% per month. The fitted RK4 trajectory is overlaid on the observed quarterly points in Figure 6.</w:t>
-      </w:r>
-    </w:p>
-    <w:p>
-      <w:pPr>
-        <w:keepNext/>
-        <w:spacing w:before="80" w:after="0" w:line="240" w:lineRule="auto"/>
-        <w:jc w:val="center"/>
-      </w:pPr>
-      <w:r>
-        <w:drawing>
-          <wp:inline xmlns:a="http://schemas.openxmlformats.org/drawingml/2006/main" xmlns:pic="http://schemas.openxmlformats.org/drawingml/2006/picture">
-            <wp:extent cx="4114800" cy="2441050"/>
-            <wp:docPr id="6" name="Picture 6"/>
-            <wp:cNvGraphicFramePr>
-              <a:graphicFrameLocks noChangeAspect="1"/>
-            </wp:cNvGraphicFramePr>
-            <a:graphic>
-              <a:graphicData uri="http://schemas.openxmlformats.org/drawingml/2006/picture">
-                <pic:pic>
-                  <pic:nvPicPr>
-                    <pic:cNvPr id="0" name="nb_shopify_fit.png"/>
-                    <pic:cNvPicPr/>
-                  </pic:nvPicPr>
-                  <pic:blipFill>
-                    <a:blip r:embed="rId14"/>
-                    <a:stretch>
-                      <a:fillRect/>
-                    </a:stretch>
-                  </pic:blipFill>
-                  <pic:spPr>
-                    <a:xfrm>
-                      <a:off x="0" y="0"/>
-                      <a:ext cx="4114800" cy="2441050"/>
-                    </a:xfrm>
-                    <a:prstGeom prst="rect"/>
-                  </pic:spPr>
-                </pic:pic>
-              </a:graphicData>
-            </a:graphic>
-          </wp:inline>
-        </w:drawing>
-      </w:r>
-    </w:p>
-    <w:p>
-      <w:pPr>
-        <w:spacing w:after="120" w:line="240" w:lineRule="auto"/>
-        <w:jc w:val="center"/>
-      </w:pPr>
-      <w:r>
-        <w:rPr>
-          <w:rFonts w:ascii="Times New Roman" w:hAnsi="Times New Roman" w:eastAsia="Times New Roman" w:cs="Times New Roman"/>
-          <w:b w:val="0"/>
-          <w:i/>
-          <w:sz w:val="20"/>
-        </w:rPr>
-        <w:t>Figure 6. Engine-fitted RK4 trajectory (navy line) overlaid on Shopify Inc. observed quarterly revenue (coral markers) from 2012-Q4 through 2014-Q4. The single fitted parameter is the user-acquisition growth rate g; all other parameters are anchored at values consistent with Shopify's publicly reported business at the time. The fitted curve captures the late-quarter revenue trend; the early quarters show a roughly $1M underfit, consistent with a 1-parameter fit attempting to model a more complex acquisition phase that would benefit from additional free parameters (and a longer observation window to identify them).</w:t>
       </w:r>
     </w:p>
     <w:p>
@@ -2569,62 +2233,6 @@
     </w:p>
     <w:p>
       <w:pPr>
-        <w:keepNext/>
-        <w:spacing w:before="80" w:after="0" w:line="240" w:lineRule="auto"/>
-        <w:jc w:val="center"/>
-      </w:pPr>
-      <w:r>
-        <w:drawing>
-          <wp:inline xmlns:a="http://schemas.openxmlformats.org/drawingml/2006/main" xmlns:pic="http://schemas.openxmlformats.org/drawingml/2006/picture">
-            <wp:extent cx="4114800" cy="2032156"/>
-            <wp:docPr id="7" name="Picture 7"/>
-            <wp:cNvGraphicFramePr>
-              <a:graphicFrameLocks noChangeAspect="1"/>
-            </wp:cNvGraphicFramePr>
-            <a:graphic>
-              <a:graphicData uri="http://schemas.openxmlformats.org/drawingml/2006/picture">
-                <pic:pic>
-                  <pic:nvPicPr>
-                    <pic:cNvPr id="0" name="nb05_mu_star_posterior.png"/>
-                    <pic:cNvPicPr/>
-                  </pic:nvPicPr>
-                  <pic:blipFill>
-                    <a:blip r:embed="rId15"/>
-                    <a:stretch>
-                      <a:fillRect/>
-                    </a:stretch>
-                  </pic:blipFill>
-                  <pic:spPr>
-                    <a:xfrm>
-                      <a:off x="0" y="0"/>
-                      <a:ext cx="4114800" cy="2032156"/>
-                    </a:xfrm>
-                    <a:prstGeom prst="rect"/>
-                  </pic:spPr>
-                </pic:pic>
-              </a:graphicData>
-            </a:graphic>
-          </wp:inline>
-        </w:drawing>
-      </w:r>
-    </w:p>
-    <w:p>
-      <w:pPr>
-        <w:spacing w:after="120" w:line="240" w:lineRule="auto"/>
-        <w:jc w:val="center"/>
-      </w:pPr>
-      <w:r>
-        <w:rPr>
-          <w:rFonts w:ascii="Times New Roman" w:hAnsi="Times New Roman" w:eastAsia="Times New Roman" w:cs="Times New Roman"/>
-          <w:b w:val="0"/>
-          <w:i/>
-          <w:sz w:val="20"/>
-        </w:rPr>
-        <w:t>Figure 7. Monte Carlo posterior over μ* (N = 199 draws). Bars are the empirical histogram, the red line is the point estimate (14.17%), the green line is the posterior mean (13.60%), and the orange band is the central 95% credible interval [8.02%, 15.99%]. The slight skew of mean below point estimate reflects asymmetry in the tails of the parameter posterior; for a normally-distributed posterior they would coincide.</w:t>
-      </w:r>
-    </w:p>
-    <w:p>
-      <w:pPr>
         <w:spacing w:line="480" w:lineRule="auto" w:after="0" w:before="0"/>
         <w:ind w:firstLine="720"/>
       </w:pPr>
@@ -2680,62 +2288,6 @@
           <w:sz w:val="24"/>
         </w:rPr>
         <w:t>Which of the eight parameters most strongly drives μ*? I answer this by computing the partial derivatives ∂μ*/∂θ_i for each parameter θ_i, holding the others at their calibrated values. Partial derivatives are evaluated by the central-difference scheme of Section 3.4 with adaptive step size scaled to each parameter's natural magnitude. The results are presented as a horizontal-bar (tornado) chart in Figure 8.</w:t>
-      </w:r>
-    </w:p>
-    <w:p>
-      <w:pPr>
-        <w:keepNext/>
-        <w:spacing w:before="80" w:after="0" w:line="240" w:lineRule="auto"/>
-        <w:jc w:val="center"/>
-      </w:pPr>
-      <w:r>
-        <w:drawing>
-          <wp:inline xmlns:a="http://schemas.openxmlformats.org/drawingml/2006/main" xmlns:pic="http://schemas.openxmlformats.org/drawingml/2006/picture">
-            <wp:extent cx="4114800" cy="2289687"/>
-            <wp:docPr id="8" name="Picture 8"/>
-            <wp:cNvGraphicFramePr>
-              <a:graphicFrameLocks noChangeAspect="1"/>
-            </wp:cNvGraphicFramePr>
-            <a:graphic>
-              <a:graphicData uri="http://schemas.openxmlformats.org/drawingml/2006/picture">
-                <pic:pic>
-                  <pic:nvPicPr>
-                    <pic:cNvPr id="0" name="nb05_tornado.png"/>
-                    <pic:cNvPicPr/>
-                  </pic:nvPicPr>
-                  <pic:blipFill>
-                    <a:blip r:embed="rId16"/>
-                    <a:stretch>
-                      <a:fillRect/>
-                    </a:stretch>
-                  </pic:blipFill>
-                  <pic:spPr>
-                    <a:xfrm>
-                      <a:off x="0" y="0"/>
-                      <a:ext cx="4114800" cy="2289687"/>
-                    </a:xfrm>
-                    <a:prstGeom prst="rect"/>
-                  </pic:spPr>
-                </pic:pic>
-              </a:graphicData>
-            </a:graphic>
-          </wp:inline>
-        </w:drawing>
-      </w:r>
-    </w:p>
-    <w:p>
-      <w:pPr>
-        <w:spacing w:after="120" w:line="240" w:lineRule="auto"/>
-        <w:jc w:val="center"/>
-      </w:pPr>
-      <w:r>
-        <w:rPr>
-          <w:rFonts w:ascii="Times New Roman" w:hAnsi="Times New Roman" w:eastAsia="Times New Roman" w:cs="Times New Roman"/>
-          <w:b w:val="0"/>
-          <w:i/>
-          <w:sz w:val="20"/>
-        </w:rPr>
-        <w:t>Figure 8. Sensitivity tornado: |∂μ*/∂θ_i| for each of the eight model parameters, sorted by magnitude. Conversion rate α dominates with |∂μ*/∂α| ≈ 3.04 (per unit α), more than twice the next-strongest parameter (billing-cycle lag μ_R, |∂μ*/∂μ_R| ≈ 1.18) and six times growth rate g (|∂μ*/∂g| ≈ 0.51). Variable cost per acquired user (v) is the only negative-signed sensitivity; market size K, ARPU p, and fixed costs F have negligible effect at the default-SaaS operating point.</w:t>
       </w:r>
     </w:p>
     <w:p>
@@ -2899,6 +2451,487 @@
           <w:sz w:val="24"/>
         </w:rPr>
         <w:t>Project repository: github.com/ArseniiChan/startup-growth-simulator. All code, tests, notebooks, and data discussed in this report.</w:t>
+      </w:r>
+    </w:p>
+    <w:p>
+      <w:r>
+        <w:br w:type="page"/>
+      </w:r>
+    </w:p>
+    <w:p>
+      <w:pPr>
+        <w:spacing w:before="120" w:after="40" w:line="240" w:lineRule="auto"/>
+      </w:pPr>
+      <w:r>
+        <w:rPr>
+          <w:rFonts w:ascii="Times New Roman" w:hAnsi="Times New Roman" w:eastAsia="Times New Roman" w:cs="Times New Roman"/>
+          <w:b/>
+          <w:i w:val="0"/>
+          <w:sz w:val="28"/>
+        </w:rPr>
+        <w:t>Appendix A: Figures</w:t>
+      </w:r>
+    </w:p>
+    <w:p>
+      <w:pPr>
+        <w:spacing w:line="480" w:lineRule="auto" w:after="0" w:before="0"/>
+      </w:pPr>
+      <w:r>
+        <w:rPr>
+          <w:rFonts w:ascii="Times New Roman" w:hAnsi="Times New Roman" w:eastAsia="Times New Roman" w:cs="Times New Roman"/>
+          <w:b w:val="0"/>
+          <w:i w:val="0"/>
+          <w:sz w:val="24"/>
+        </w:rPr>
+        <w:t>All figures referenced in the body of the report, in the order they are first cited.</w:t>
+      </w:r>
+    </w:p>
+    <w:p>
+      <w:pPr>
+        <w:keepNext/>
+        <w:spacing w:before="80" w:after="0" w:line="240" w:lineRule="auto"/>
+        <w:jc w:val="center"/>
+      </w:pPr>
+      <w:r>
+        <w:drawing>
+          <wp:inline xmlns:a="http://schemas.openxmlformats.org/drawingml/2006/main" xmlns:pic="http://schemas.openxmlformats.org/drawingml/2006/picture">
+            <wp:extent cx="5029200" cy="3190477"/>
+            <wp:docPr id="1" name="Picture 1"/>
+            <wp:cNvGraphicFramePr>
+              <a:graphicFrameLocks noChangeAspect="1"/>
+            </wp:cNvGraphicFramePr>
+            <a:graphic>
+              <a:graphicData uri="http://schemas.openxmlformats.org/drawingml/2006/picture">
+                <pic:pic>
+                  <pic:nvPicPr>
+                    <pic:cNvPr id="0" name="nb01_default_trajectory.png"/>
+                    <pic:cNvPicPr/>
+                  </pic:nvPicPr>
+                  <pic:blipFill>
+                    <a:blip r:embed="rId9"/>
+                    <a:stretch>
+                      <a:fillRect/>
+                    </a:stretch>
+                  </pic:blipFill>
+                  <pic:spPr>
+                    <a:xfrm>
+                      <a:off x="0" y="0"/>
+                      <a:ext cx="5029200" cy="3190477"/>
+                    </a:xfrm>
+                    <a:prstGeom prst="rect"/>
+                  </pic:spPr>
+                </pic:pic>
+              </a:graphicData>
+            </a:graphic>
+          </wp:inline>
+        </w:drawing>
+      </w:r>
+    </w:p>
+    <w:p>
+      <w:pPr>
+        <w:spacing w:after="200" w:line="240" w:lineRule="auto"/>
+        <w:jc w:val="center"/>
+      </w:pPr>
+      <w:r>
+        <w:rPr>
+          <w:rFonts w:ascii="Times New Roman" w:hAnsi="Times New Roman" w:eastAsia="Times New Roman" w:cs="Times New Roman"/>
+          <w:b w:val="0"/>
+          <w:i/>
+          <w:sz w:val="20"/>
+        </w:rPr>
+        <w:t>Figure 1. Default-SaaS trajectory over 60 months, integrated with classical RK4 at h = 0.1. Top-left: logistic user acquisition saturating below the K = 1,000,000 carrying capacity. Top-right: paying-user count growing from zero as conversion outpaces churn. Bottom-left: monthly recurring revenue catching up to the paying-user base on the billing-cycle timescale 1/μ_R = 25 months. Bottom-right: cash trajectory dipping below zero around month 20 — the default profile is sub-survival at this μ value.</w:t>
+      </w:r>
+    </w:p>
+    <w:p>
+      <w:pPr>
+        <w:keepNext/>
+        <w:spacing w:before="80" w:after="0" w:line="240" w:lineRule="auto"/>
+        <w:jc w:val="center"/>
+      </w:pPr>
+      <w:r>
+        <w:drawing>
+          <wp:inline xmlns:a="http://schemas.openxmlformats.org/drawingml/2006/main" xmlns:pic="http://schemas.openxmlformats.org/drawingml/2006/picture">
+            <wp:extent cx="5029200" cy="3117177"/>
+            <wp:docPr id="2" name="Picture 2"/>
+            <wp:cNvGraphicFramePr>
+              <a:graphicFrameLocks noChangeAspect="1"/>
+            </wp:cNvGraphicFramePr>
+            <a:graphic>
+              <a:graphicData uri="http://schemas.openxmlformats.org/drawingml/2006/picture">
+                <pic:pic>
+                  <pic:nvPicPr>
+                    <pic:cNvPr id="0" name="nb02_convergence.png"/>
+                    <pic:cNvPicPr/>
+                  </pic:nvPicPr>
+                  <pic:blipFill>
+                    <a:blip r:embed="rId10"/>
+                    <a:stretch>
+                      <a:fillRect/>
+                    </a:stretch>
+                  </pic:blipFill>
+                  <pic:spPr>
+                    <a:xfrm>
+                      <a:off x="0" y="0"/>
+                      <a:ext cx="5029200" cy="3117177"/>
+                    </a:xfrm>
+                    <a:prstGeom prst="rect"/>
+                  </pic:spPr>
+                </pic:pic>
+              </a:graphicData>
+            </a:graphic>
+          </wp:inline>
+        </w:drawing>
+      </w:r>
+    </w:p>
+    <w:p>
+      <w:pPr>
+        <w:spacing w:after="200" w:line="240" w:lineRule="auto"/>
+        <w:jc w:val="center"/>
+      </w:pPr>
+      <w:r>
+        <w:rPr>
+          <w:rFonts w:ascii="Times New Roman" w:hAnsi="Times New Roman" w:eastAsia="Times New Roman" w:cs="Times New Roman"/>
+          <w:b w:val="0"/>
+          <w:i/>
+          <w:sz w:val="20"/>
+        </w:rPr>
+        <w:t>Figure 2. Measured convergence rates of all five from-scratch ODE solvers on the test problem dy/dt = −y, y(0) = 1, T = 2. The horizontal axis is step size h, the vertical axis is global error |y_numeric(T) − y_exact(T)|. Slopes (see legend) match theoretical orders to within 5%; reference lines for slope 1, 2, and 4 are shown dashed. Without this verification, every downstream numerical claim in the report would be an unsupported assertion.</w:t>
+      </w:r>
+    </w:p>
+    <w:p>
+      <w:pPr>
+        <w:keepNext/>
+        <w:spacing w:before="80" w:after="0" w:line="240" w:lineRule="auto"/>
+        <w:jc w:val="center"/>
+      </w:pPr>
+      <w:r>
+        <w:drawing>
+          <wp:inline xmlns:a="http://schemas.openxmlformats.org/drawingml/2006/main" xmlns:pic="http://schemas.openxmlformats.org/drawingml/2006/picture">
+            <wp:extent cx="5029200" cy="3192912"/>
+            <wp:docPr id="3" name="Picture 3"/>
+            <wp:cNvGraphicFramePr>
+              <a:graphicFrameLocks noChangeAspect="1"/>
+            </wp:cNvGraphicFramePr>
+            <a:graphic>
+              <a:graphicData uri="http://schemas.openxmlformats.org/drawingml/2006/picture">
+                <pic:pic>
+                  <pic:nvPicPr>
+                    <pic:cNvPr id="0" name="pres_root_finder_convergence.png"/>
+                    <pic:cNvPicPr/>
+                  </pic:nvPicPr>
+                  <pic:blipFill>
+                    <a:blip r:embed="rId11"/>
+                    <a:stretch>
+                      <a:fillRect/>
+                    </a:stretch>
+                  </pic:blipFill>
+                  <pic:spPr>
+                    <a:xfrm>
+                      <a:off x="0" y="0"/>
+                      <a:ext cx="5029200" cy="3192912"/>
+                    </a:xfrm>
+                    <a:prstGeom prst="rect"/>
+                  </pic:spPr>
+                </pic:pic>
+              </a:graphicData>
+            </a:graphic>
+          </wp:inline>
+        </w:drawing>
+      </w:r>
+    </w:p>
+    <w:p>
+      <w:pPr>
+        <w:spacing w:after="200" w:line="240" w:lineRule="auto"/>
+        <w:jc w:val="center"/>
+      </w:pPr>
+      <w:r>
+        <w:rPr>
+          <w:rFonts w:ascii="Times New Roman" w:hAnsi="Times New Roman" w:eastAsia="Times New Roman" w:cs="Times New Roman"/>
+          <w:b w:val="0"/>
+          <w:i/>
+          <w:sz w:val="20"/>
+        </w:rPr>
+        <w:t>Figure 3. Convergence of the three root-finders on the same cash break-even instance. Newton (coral) achieves error below 10⁻⁹ in 4 iterations — quadratic convergence is visible as the error roughly doubling its negative log each step. Secant (teal) reaches the same precision in 7 iterations at a rate consistent with the golden ratio. Bisection (navy) takes 18 iterations to reach 10⁻⁸ — its log-error decreases linearly at one bit per iteration, exactly as the textbook predicts. All three converge to the same μ* ≈ 0.142 (14.2% per month).</w:t>
+      </w:r>
+    </w:p>
+    <w:p>
+      <w:pPr>
+        <w:keepNext/>
+        <w:spacing w:before="80" w:after="0" w:line="240" w:lineRule="auto"/>
+        <w:jc w:val="center"/>
+      </w:pPr>
+      <w:r>
+        <w:drawing>
+          <wp:inline xmlns:a="http://schemas.openxmlformats.org/drawingml/2006/main" xmlns:pic="http://schemas.openxmlformats.org/drawingml/2006/picture">
+            <wp:extent cx="5029200" cy="3213235"/>
+            <wp:docPr id="4" name="Picture 4"/>
+            <wp:cNvGraphicFramePr>
+              <a:graphicFrameLocks noChangeAspect="1"/>
+            </wp:cNvGraphicFramePr>
+            <a:graphic>
+              <a:graphicData uri="http://schemas.openxmlformats.org/drawingml/2006/picture">
+                <pic:pic>
+                  <pic:nvPicPr>
+                    <pic:cNvPr id="0" name="pres_loss_surface.png"/>
+                    <pic:cNvPicPr/>
+                  </pic:nvPicPr>
+                  <pic:blipFill>
+                    <a:blip r:embed="rId12"/>
+                    <a:stretch>
+                      <a:fillRect/>
+                    </a:stretch>
+                  </pic:blipFill>
+                  <pic:spPr>
+                    <a:xfrm>
+                      <a:off x="0" y="0"/>
+                      <a:ext cx="5029200" cy="3213235"/>
+                    </a:xfrm>
+                    <a:prstGeom prst="rect"/>
+                  </pic:spPr>
+                </pic:pic>
+              </a:graphicData>
+            </a:graphic>
+          </wp:inline>
+        </w:drawing>
+      </w:r>
+    </w:p>
+    <w:p>
+      <w:pPr>
+        <w:spacing w:after="200" w:line="240" w:lineRule="auto"/>
+        <w:jc w:val="center"/>
+      </w:pPr>
+      <w:r>
+        <w:rPr>
+          <w:rFonts w:ascii="Times New Roman" w:hAnsi="Times New Roman" w:eastAsia="Times New Roman" w:cs="Times New Roman"/>
+          <w:b w:val="0"/>
+          <w:i/>
+          <w:sz w:val="20"/>
+        </w:rPr>
+        <w:t>Figure 4. Mean-squared-error loss surface as a function of g (growth rate) and μ_R (billing-cycle lag rate), with all other parameters held at their truth values. The yellow-green band is the locus of near-minimum loss. The truth (red star, g = 0.15, μ_R = 0.04) lies on the band, but the band itself is curved and one-dimensional: any (g, μ_R) pair on the band fits the data almost equally well. This is the structural-identifiability problem.</w:t>
+      </w:r>
+    </w:p>
+    <w:p>
+      <w:pPr>
+        <w:keepNext/>
+        <w:spacing w:before="80" w:after="0" w:line="240" w:lineRule="auto"/>
+        <w:jc w:val="center"/>
+      </w:pPr>
+      <w:r>
+        <w:drawing>
+          <wp:inline xmlns:a="http://schemas.openxmlformats.org/drawingml/2006/main" xmlns:pic="http://schemas.openxmlformats.org/drawingml/2006/picture">
+            <wp:extent cx="5029200" cy="1649485"/>
+            <wp:docPr id="5" name="Picture 5"/>
+            <wp:cNvGraphicFramePr>
+              <a:graphicFrameLocks noChangeAspect="1"/>
+            </wp:cNvGraphicFramePr>
+            <a:graphic>
+              <a:graphicData uri="http://schemas.openxmlformats.org/drawingml/2006/picture">
+                <pic:pic>
+                  <pic:nvPicPr>
+                    <pic:cNvPr id="0" name="nb05_profile_likelihood.png"/>
+                    <pic:cNvPicPr/>
+                  </pic:nvPicPr>
+                  <pic:blipFill>
+                    <a:blip r:embed="rId13"/>
+                    <a:stretch>
+                      <a:fillRect/>
+                    </a:stretch>
+                  </pic:blipFill>
+                  <pic:spPr>
+                    <a:xfrm>
+                      <a:off x="0" y="0"/>
+                      <a:ext cx="5029200" cy="1649485"/>
+                    </a:xfrm>
+                    <a:prstGeom prst="rect"/>
+                  </pic:spPr>
+                </pic:pic>
+              </a:graphicData>
+            </a:graphic>
+          </wp:inline>
+        </w:drawing>
+      </w:r>
+    </w:p>
+    <w:p>
+      <w:pPr>
+        <w:spacing w:after="200" w:line="240" w:lineRule="auto"/>
+        <w:jc w:val="center"/>
+      </w:pPr>
+      <w:r>
+        <w:rPr>
+          <w:rFonts w:ascii="Times New Roman" w:hAnsi="Times New Roman" w:eastAsia="Times New Roman" w:cs="Times New Roman"/>
+          <w:b w:val="0"/>
+          <w:i/>
+          <w:sz w:val="20"/>
+        </w:rPr>
+        <w:t>Figure 5. Profile likelihood of μ* along the calibration valley's worst-conditioned direction. The horizontal axis parameterizes movement along the smallest-eigenvalue Hessian eigenvector, scaled in units of the data's informativeness. μ* drifts by approximately 2.4% across the entire valley traversal. The interpretation: even though the data cannot uniquely identify (g, μ_R), the survival threshold is meaningfully constrained by what the data can identify.</w:t>
+      </w:r>
+    </w:p>
+    <w:p>
+      <w:pPr>
+        <w:keepNext/>
+        <w:spacing w:before="80" w:after="0" w:line="240" w:lineRule="auto"/>
+        <w:jc w:val="center"/>
+      </w:pPr>
+      <w:r>
+        <w:drawing>
+          <wp:inline xmlns:a="http://schemas.openxmlformats.org/drawingml/2006/main" xmlns:pic="http://schemas.openxmlformats.org/drawingml/2006/picture">
+            <wp:extent cx="5029200" cy="2988364"/>
+            <wp:docPr id="6" name="Picture 6"/>
+            <wp:cNvGraphicFramePr>
+              <a:graphicFrameLocks noChangeAspect="1"/>
+            </wp:cNvGraphicFramePr>
+            <a:graphic>
+              <a:graphicData uri="http://schemas.openxmlformats.org/drawingml/2006/picture">
+                <pic:pic>
+                  <pic:nvPicPr>
+                    <pic:cNvPr id="0" name="nb_shopify_fit.png"/>
+                    <pic:cNvPicPr/>
+                  </pic:nvPicPr>
+                  <pic:blipFill>
+                    <a:blip r:embed="rId14"/>
+                    <a:stretch>
+                      <a:fillRect/>
+                    </a:stretch>
+                  </pic:blipFill>
+                  <pic:spPr>
+                    <a:xfrm>
+                      <a:off x="0" y="0"/>
+                      <a:ext cx="5029200" cy="2988364"/>
+                    </a:xfrm>
+                    <a:prstGeom prst="rect"/>
+                  </pic:spPr>
+                </pic:pic>
+              </a:graphicData>
+            </a:graphic>
+          </wp:inline>
+        </w:drawing>
+      </w:r>
+    </w:p>
+    <w:p>
+      <w:pPr>
+        <w:spacing w:after="200" w:line="240" w:lineRule="auto"/>
+        <w:jc w:val="center"/>
+      </w:pPr>
+      <w:r>
+        <w:rPr>
+          <w:rFonts w:ascii="Times New Roman" w:hAnsi="Times New Roman" w:eastAsia="Times New Roman" w:cs="Times New Roman"/>
+          <w:b w:val="0"/>
+          <w:i/>
+          <w:sz w:val="20"/>
+        </w:rPr>
+        <w:t>Figure 6. Engine-fitted RK4 trajectory (navy line) overlaid on Shopify Inc. observed quarterly revenue (coral markers) from 2012-Q4 through 2014-Q4. The single fitted parameter is the user-acquisition growth rate g; all other parameters are anchored at values consistent with Shopify's publicly reported business at the time. The fitted curve captures the late-quarter revenue trend; the early quarters show a roughly $1M underfit, consistent with a 1-parameter fit attempting to model a more complex acquisition phase that would benefit from additional free parameters (and a longer observation window to identify them).</w:t>
+      </w:r>
+    </w:p>
+    <w:p>
+      <w:pPr>
+        <w:keepNext/>
+        <w:spacing w:before="80" w:after="0" w:line="240" w:lineRule="auto"/>
+        <w:jc w:val="center"/>
+      </w:pPr>
+      <w:r>
+        <w:drawing>
+          <wp:inline xmlns:a="http://schemas.openxmlformats.org/drawingml/2006/main" xmlns:pic="http://schemas.openxmlformats.org/drawingml/2006/picture">
+            <wp:extent cx="5029200" cy="2483746"/>
+            <wp:docPr id="7" name="Picture 7"/>
+            <wp:cNvGraphicFramePr>
+              <a:graphicFrameLocks noChangeAspect="1"/>
+            </wp:cNvGraphicFramePr>
+            <a:graphic>
+              <a:graphicData uri="http://schemas.openxmlformats.org/drawingml/2006/picture">
+                <pic:pic>
+                  <pic:nvPicPr>
+                    <pic:cNvPr id="0" name="nb05_mu_star_posterior.png"/>
+                    <pic:cNvPicPr/>
+                  </pic:nvPicPr>
+                  <pic:blipFill>
+                    <a:blip r:embed="rId15"/>
+                    <a:stretch>
+                      <a:fillRect/>
+                    </a:stretch>
+                  </pic:blipFill>
+                  <pic:spPr>
+                    <a:xfrm>
+                      <a:off x="0" y="0"/>
+                      <a:ext cx="5029200" cy="2483746"/>
+                    </a:xfrm>
+                    <a:prstGeom prst="rect"/>
+                  </pic:spPr>
+                </pic:pic>
+              </a:graphicData>
+            </a:graphic>
+          </wp:inline>
+        </w:drawing>
+      </w:r>
+    </w:p>
+    <w:p>
+      <w:pPr>
+        <w:spacing w:after="200" w:line="240" w:lineRule="auto"/>
+        <w:jc w:val="center"/>
+      </w:pPr>
+      <w:r>
+        <w:rPr>
+          <w:rFonts w:ascii="Times New Roman" w:hAnsi="Times New Roman" w:eastAsia="Times New Roman" w:cs="Times New Roman"/>
+          <w:b w:val="0"/>
+          <w:i/>
+          <w:sz w:val="20"/>
+        </w:rPr>
+        <w:t>Figure 7. Monte Carlo posterior over μ* (N = 199 draws). Bars are the empirical histogram, the red line is the point estimate (14.17%), the green line is the posterior mean (13.60%), and the orange band is the central 95% credible interval [8.02%, 15.99%]. The slight skew of mean below point estimate reflects asymmetry in the tails of the parameter posterior; for a normally-distributed posterior they would coincide.</w:t>
+      </w:r>
+    </w:p>
+    <w:p>
+      <w:pPr>
+        <w:keepNext/>
+        <w:spacing w:before="80" w:after="0" w:line="240" w:lineRule="auto"/>
+        <w:jc w:val="center"/>
+      </w:pPr>
+      <w:r>
+        <w:drawing>
+          <wp:inline xmlns:a="http://schemas.openxmlformats.org/drawingml/2006/main" xmlns:pic="http://schemas.openxmlformats.org/drawingml/2006/picture">
+            <wp:extent cx="5029200" cy="2798506"/>
+            <wp:docPr id="8" name="Picture 8"/>
+            <wp:cNvGraphicFramePr>
+              <a:graphicFrameLocks noChangeAspect="1"/>
+            </wp:cNvGraphicFramePr>
+            <a:graphic>
+              <a:graphicData uri="http://schemas.openxmlformats.org/drawingml/2006/picture">
+                <pic:pic>
+                  <pic:nvPicPr>
+                    <pic:cNvPr id="0" name="nb05_tornado.png"/>
+                    <pic:cNvPicPr/>
+                  </pic:nvPicPr>
+                  <pic:blipFill>
+                    <a:blip r:embed="rId16"/>
+                    <a:stretch>
+                      <a:fillRect/>
+                    </a:stretch>
+                  </pic:blipFill>
+                  <pic:spPr>
+                    <a:xfrm>
+                      <a:off x="0" y="0"/>
+                      <a:ext cx="5029200" cy="2798506"/>
+                    </a:xfrm>
+                    <a:prstGeom prst="rect"/>
+                  </pic:spPr>
+                </pic:pic>
+              </a:graphicData>
+            </a:graphic>
+          </wp:inline>
+        </w:drawing>
+      </w:r>
+    </w:p>
+    <w:p>
+      <w:pPr>
+        <w:spacing w:after="200" w:line="240" w:lineRule="auto"/>
+        <w:jc w:val="center"/>
+      </w:pPr>
+      <w:r>
+        <w:rPr>
+          <w:rFonts w:ascii="Times New Roman" w:hAnsi="Times New Roman" w:eastAsia="Times New Roman" w:cs="Times New Roman"/>
+          <w:b w:val="0"/>
+          <w:i/>
+          <w:sz w:val="20"/>
+        </w:rPr>
+        <w:t>Figure 8. Sensitivity tornado: |∂μ*/∂θ_i| for each of the eight model parameters, sorted by magnitude. Conversion rate α dominates with |∂μ*/∂α| ≈ 3.04 (per unit α), more than twice the next-strongest parameter (billing-cycle lag μ_R, |∂μ*/∂μ_R| ≈ 1.18) and six times growth rate g (|∂μ*/∂g| ≈ 0.51). Variable cost per acquired user (v) is the only negative-signed sensitivity; market size K, ARPU p, and fixed costs F have negligible effect at the default-SaaS operating point.</w:t>
       </w:r>
     </w:p>
     <w:sectPr>

</xml_diff>

<commit_message>
Report: regenerate Figure 8 to match its caption
The embedded tornado figure (nb05_tornado.png) was rendered from an
earlier sensitivity run (3.04 / 1.18 / 0.51 visible) while the report
body and caption had been updated to cite the values from the current
tornado.json (2.70 / 1.35 / negligible). The figure and caption
disagreed.

Add scripts/render_tornado_figure.py to render nb05_tornado.png from
the canonical tornado.json so the figure and caption stay in sync.
Figure now shows alpha at 2.70 and mu_R at 1.35 (exactly twice), with
the remaining six parameters at zero — matches the caption's claim.
</commit_message>
<xml_diff>
--- a/report/Chan_Arsenii_CSC30100_FinalReport.docx
+++ b/report/Chan_Arsenii_CSC30100_FinalReport.docx
@@ -2887,7 +2887,7 @@
       <w:r>
         <w:drawing>
           <wp:inline xmlns:a="http://schemas.openxmlformats.org/drawingml/2006/main" xmlns:pic="http://schemas.openxmlformats.org/drawingml/2006/picture">
-            <wp:extent cx="5029200" cy="2798506"/>
+            <wp:extent cx="5029200" cy="2859932"/>
             <wp:docPr id="8" name="Picture 8"/>
             <wp:cNvGraphicFramePr>
               <a:graphicFrameLocks noChangeAspect="1"/>
@@ -2908,7 +2908,7 @@
                   <pic:spPr>
                     <a:xfrm>
                       <a:off x="0" y="0"/>
-                      <a:ext cx="5029200" cy="2798506"/>
+                      <a:ext cx="5029200" cy="2859932"/>
                     </a:xfrm>
                     <a:prstGeom prst="rect"/>
                   </pic:spPr>

</xml_diff>